<commit_message>
Add per-field probability alerts and update MT5 docs.
Split probability cell rendering into three field-level blocks so only the threshold-breaching metric turns red, and update instruction/spec files with MT5-only clarifications and renamed technical specification PDF.

Made-with: Cursor
</commit_message>
<xml_diff>
--- a/Инструкция советник Acteck.docx
+++ b/Инструкция советник Acteck.docx
@@ -1229,6 +1229,47 @@
         </w:rPr>
         <w:br/>
         <w:t>Обновляем терминал, присоединяем индикатор к графику.</w:t>
+      </w:r>
+    </w:p>
+    <w:p/>
+    <w:p>
+      <w:r>
+        <w:t>Обновление правил отображения (MT5, 2026):</w:t>
+      </w:r>
+    </w:p>
+    <w:p>
+      <w:r>
+        <w:t>1) Формат ячейки в режиме «Вероятность»: Вероятность % | Макс коррекция на всём участке текущего тренда | Текущее отклонение от последнего экстремума.</w:t>
+      </w:r>
+    </w:p>
+    <w:p>
+      <w:r>
+        <w:t>2) Подсветка красным применяется точечно: только к тому полю, которое вышло за предельное значение.</w:t>
+      </w:r>
+    </w:p>
+    <w:p>
+      <w:r>
+        <w:t>3) Пороговые значения для фильтра волатильности:</w:t>
+      </w:r>
+    </w:p>
+    <w:p>
+      <w:r>
+        <w:t xml:space="preserve">   - макс. коррекция на всём участке тренда: 80% фильтра;</w:t>
+      </w:r>
+    </w:p>
+    <w:p>
+      <w:r>
+        <w:t xml:space="preserve">   - макс. коррекция от последнего экстремума: 60% фильтра;</w:t>
+      </w:r>
+    </w:p>
+    <w:p>
+      <w:r>
+        <w:t xml:space="preserve">   - текущее отклонение от последнего экстремума: 40% фильтра.</w:t>
+      </w:r>
+    </w:p>
+    <w:p>
+      <w:r>
+        <w:t>4) Пример: для ФВ 50 -&gt; 40/30/20; для ФВ 100 -&gt; 80/60/40.</w:t>
       </w:r>
     </w:p>
     <w:sectPr>

</xml_diff>